<commit_message>
Anleitungen v2: dunkle Schrift, alle neuen Features dokumentiert
</commit_message>
<xml_diff>
--- a/Anleitung_ArbeitgeberPro.docx
+++ b/Anleitung_ArbeitgeberPro.docx
@@ -27,7 +27,7 @@
       <w:r>
         <w:rPr>
           <w:rFonts w:ascii="Arial" w:cs="Arial" w:eastAsia="Arial" w:hAnsi="Arial"/>
-          <w:color w:val="64748B"/>
+          <w:color w:val="4B5563"/>
           <w:sz w:val="30"/>
           <w:szCs w:val="30"/>
         </w:rPr>
@@ -42,7 +42,7 @@
       <w:r>
         <w:rPr>
           <w:rFonts w:ascii="Arial" w:cs="Arial" w:eastAsia="Arial" w:hAnsi="Arial"/>
-          <w:color w:val="94A3B8"/>
+          <w:color w:val="6B7280"/>
           <w:sz w:val="22"/>
           <w:szCs w:val="22"/>
         </w:rPr>
@@ -57,7 +57,7 @@
       <w:r>
         <w:rPr>
           <w:rFonts w:ascii="Arial" w:cs="Arial" w:eastAsia="Arial" w:hAnsi="Arial"/>
-          <w:color w:val="94A3B8"/>
+          <w:color w:val="6B7280"/>
           <w:sz w:val="20"/>
           <w:szCs w:val="20"/>
         </w:rPr>
@@ -71,7 +71,7 @@
       <w:r>
         <w:rPr>
           <w:rFonts w:ascii="Arial" w:cs="Arial" w:eastAsia="Arial" w:hAnsi="Arial"/>
-          <w:color w:val="CBD5E1"/>
+          <w:color w:val="9CA3AF"/>
           <w:sz w:val="18"/>
           <w:szCs w:val="18"/>
         </w:rPr>
@@ -107,11 +107,11 @@
       <w:r>
         <w:rPr>
           <w:rFonts w:ascii="Arial" w:cs="Arial" w:eastAsia="Arial" w:hAnsi="Arial"/>
-          <w:color w:val="374151"/>
+          <w:color w:val="1F2937"/>
           <w:sz w:val="22"/>
           <w:szCs w:val="22"/>
         </w:rPr>
-        <w:t xml:space="preserve">Der Betrieb erhält Zugangsdaten von der Verwaltung oder registriert sich über den Firmennamen des Azubi.</w:t>
+        <w:t xml:space="preserve">Zugangsdaten von der Verwaltung oder Registrierung über Firmennamen.</w:t>
       </w:r>
     </w:p>
     <w:p>
@@ -121,11 +121,11 @@
       <w:r>
         <w:rPr>
           <w:rFonts w:ascii="Arial" w:cs="Arial" w:eastAsia="Arial" w:hAnsi="Arial"/>
-          <w:color w:val="374151"/>
+          <w:color w:val="1F2937"/>
           <w:sz w:val="22"/>
           <w:szCs w:val="22"/>
         </w:rPr>
-        <w:t xml:space="preserve">Öffne die App unter: https://mohr-app.github.io/ausbilderpro/ArbeitgeberPro.html</w:t>
+        <w:t xml:space="preserve">URL: https://mohr-app.github.io/ausbilderpro/ArbeitgeberPro.html</w:t>
       </w:r>
     </w:p>
     <w:p>
@@ -176,7 +176,7 @@
               <w:bottom w:val="none" w:sz="0"/>
               <w:right w:val="none" w:sz="0"/>
             </w:tcBorders>
-            <w:shd w:fill="F0F4FF" w:val="clear"/>
+            <w:shd w:fill="EEF2FF" w:val="clear"/>
             <w:tcMar>
               <w:top w:type="dxa" w:w="80"/>
               <w:left w:type="dxa" w:w="80"/>
@@ -207,7 +207,7 @@
               <w:bottom w:val="none" w:sz="0"/>
               <w:right w:val="none" w:sz="0"/>
             </w:tcBorders>
-            <w:shd w:fill="F0F4FF" w:val="clear"/>
+            <w:shd w:fill="EEF2FF" w:val="clear"/>
             <w:tcMar>
               <w:top w:type="dxa" w:w="80"/>
               <w:left w:type="dxa" w:w="80"/>
@@ -235,11 +235,11 @@
             <w:r>
               <w:rPr>
                 <w:rFonts w:ascii="Arial" w:cs="Arial" w:eastAsia="Arial" w:hAnsi="Arial"/>
-                <w:color w:val="6B7280"/>
+                <w:color w:val="374151"/>
                 <w:sz w:val="20"/>
                 <w:szCs w:val="20"/>
               </w:rPr>
-              <w:t xml:space="preserve">Aktiver Kurs oben als Karte mit Kursname, Zeitraum, Ausbilder und Standort. Weitere Lehrgänge als Liste.</w:t>
+              <w:t xml:space="preserve">Aktiver Kurs als Karte, weitere als Liste. Kursname, Zeitraum, Ausbilder, Standort.</w:t>
             </w:r>
           </w:p>
         </w:tc>
@@ -276,7 +276,7 @@
               <w:bottom w:val="none" w:sz="0"/>
               <w:right w:val="none" w:sz="0"/>
             </w:tcBorders>
-            <w:shd w:fill="F0F4FF" w:val="clear"/>
+            <w:shd w:fill="EEF2FF" w:val="clear"/>
             <w:tcMar>
               <w:top w:type="dxa" w:w="80"/>
               <w:left w:type="dxa" w:w="80"/>
@@ -307,7 +307,7 @@
               <w:bottom w:val="none" w:sz="0"/>
               <w:right w:val="none" w:sz="0"/>
             </w:tcBorders>
-            <w:shd w:fill="F0F4FF" w:val="clear"/>
+            <w:shd w:fill="EEF2FF" w:val="clear"/>
             <w:tcMar>
               <w:top w:type="dxa" w:w="80"/>
               <w:left w:type="dxa" w:w="80"/>
@@ -335,11 +335,11 @@
             <w:r>
               <w:rPr>
                 <w:rFonts w:ascii="Arial" w:cs="Arial" w:eastAsia="Arial" w:hAnsi="Arial"/>
-                <w:color w:val="6B7280"/>
+                <w:color w:val="374151"/>
                 <w:sz w:val="20"/>
                 <w:szCs w:val="20"/>
               </w:rPr>
-              <w:t xml:space="preserve">Pro Azubi: Anwesenheitsquote, aktuelle Noten (nach Kursende), Werkzeug-Status.</w:t>
+              <w:t xml:space="preserve">Anwesenheitsquote, Noten (nach Kursende), Werkzeug-Status pro Azubi.</w:t>
             </w:r>
           </w:p>
         </w:tc>
@@ -349,6 +349,23 @@
       <w:pPr>
         <w:spacing w:after="80"/>
       </w:pPr>
+    </w:p>
+    <w:p>
+      <w:pPr>
+        <w:pStyle w:val="Heading1"/>
+        <w:spacing w:before="400" w:after="200"/>
+      </w:pPr>
+      <w:r>
+        <w:rPr>
+          <w:rFonts w:ascii="Arial" w:cs="Arial" w:eastAsia="Arial" w:hAnsi="Arial"/>
+          <w:b/>
+          <w:bCs/>
+          <w:color w:val="1E40AF"/>
+          <w:sz w:val="32"/>
+          <w:szCs w:val="32"/>
+        </w:rPr>
+        <w:t xml:space="preserve">3. Benachrichtigungen</w:t>
+      </w:r>
     </w:p>
     <w:tbl>
       <w:tblPr>
@@ -376,7 +393,7 @@
               <w:bottom w:val="none" w:sz="0"/>
               <w:right w:val="none" w:sz="0"/>
             </w:tcBorders>
-            <w:shd w:fill="F0F4FF" w:val="clear"/>
+            <w:shd w:fill="EEF2FF" w:val="clear"/>
             <w:tcMar>
               <w:top w:type="dxa" w:w="80"/>
               <w:left w:type="dxa" w:w="80"/>
@@ -394,7 +411,7 @@
                 <w:sz w:val="28"/>
                 <w:szCs w:val="28"/>
               </w:rPr>
-              <w:t xml:space="preserve">📊</w:t>
+              <w:t xml:space="preserve">⚠</w:t>
             </w:r>
           </w:p>
         </w:tc>
@@ -407,7 +424,7 @@
               <w:bottom w:val="none" w:sz="0"/>
               <w:right w:val="none" w:sz="0"/>
             </w:tcBorders>
-            <w:shd w:fill="F0F4FF" w:val="clear"/>
+            <w:shd w:fill="EEF2FF" w:val="clear"/>
             <w:tcMar>
               <w:top w:type="dxa" w:w="80"/>
               <w:left w:type="dxa" w:w="80"/>
@@ -425,7 +442,7 @@
                 <w:sz w:val="22"/>
                 <w:szCs w:val="22"/>
               </w:rPr>
-              <w:t xml:space="preserve">Anwesenheit</w:t>
+              <w:t xml:space="preserve">Kursausfall</w:t>
             </w:r>
           </w:p>
           <w:p>
@@ -435,11 +452,11 @@
             <w:r>
               <w:rPr>
                 <w:rFonts w:ascii="Arial" w:cs="Arial" w:eastAsia="Arial" w:hAnsi="Arial"/>
-                <w:color w:val="6B7280"/>
+                <w:color w:val="374151"/>
                 <w:sz w:val="20"/>
                 <w:szCs w:val="20"/>
               </w:rPr>
-              <w:t xml:space="preserve">Echtzeit-Anwesenheitsdaten: Prozent, anwesende Tage, Krankheitstage, Fehlzeiten.</w:t>
+              <w:t xml:space="preserve">Roter pulsierender Alarm-Banner.</w:t>
             </w:r>
           </w:p>
         </w:tc>
@@ -449,23 +466,6 @@
       <w:pPr>
         <w:spacing w:after="80"/>
       </w:pPr>
-    </w:p>
-    <w:p>
-      <w:pPr>
-        <w:pStyle w:val="Heading1"/>
-        <w:spacing w:before="400" w:after="200"/>
-      </w:pPr>
-      <w:r>
-        <w:rPr>
-          <w:rFonts w:ascii="Arial" w:cs="Arial" w:eastAsia="Arial" w:hAnsi="Arial"/>
-          <w:b/>
-          <w:bCs/>
-          <w:color w:val="1E40AF"/>
-          <w:sz w:val="32"/>
-          <w:szCs w:val="32"/>
-        </w:rPr>
-        <w:t xml:space="preserve">3. Benachrichtigungen</w:t>
-      </w:r>
     </w:p>
     <w:tbl>
       <w:tblPr>
@@ -493,7 +493,7 @@
               <w:bottom w:val="none" w:sz="0"/>
               <w:right w:val="none" w:sz="0"/>
             </w:tcBorders>
-            <w:shd w:fill="F0F4FF" w:val="clear"/>
+            <w:shd w:fill="EEF2FF" w:val="clear"/>
             <w:tcMar>
               <w:top w:type="dxa" w:w="80"/>
               <w:left w:type="dxa" w:w="80"/>
@@ -511,7 +511,7 @@
                 <w:sz w:val="28"/>
                 <w:szCs w:val="28"/>
               </w:rPr>
-              <w:t xml:space="preserve">⚠</w:t>
+              <w:t xml:space="preserve">📧</w:t>
             </w:r>
           </w:p>
         </w:tc>
@@ -524,7 +524,7 @@
               <w:bottom w:val="none" w:sz="0"/>
               <w:right w:val="none" w:sz="0"/>
             </w:tcBorders>
-            <w:shd w:fill="F0F4FF" w:val="clear"/>
+            <w:shd w:fill="EEF2FF" w:val="clear"/>
             <w:tcMar>
               <w:top w:type="dxa" w:w="80"/>
               <w:left w:type="dxa" w:w="80"/>
@@ -542,7 +542,7 @@
                 <w:sz w:val="22"/>
                 <w:szCs w:val="22"/>
               </w:rPr>
-              <w:t xml:space="preserve">Kursausfall</w:t>
+              <w:t xml:space="preserve">Kontakt</w:t>
             </w:r>
           </w:p>
           <w:p>
@@ -552,111 +552,11 @@
             <w:r>
               <w:rPr>
                 <w:rFonts w:ascii="Arial" w:cs="Arial" w:eastAsia="Arial" w:hAnsi="Arial"/>
-                <w:color w:val="6B7280"/>
+                <w:color w:val="374151"/>
                 <w:sz w:val="20"/>
                 <w:szCs w:val="20"/>
               </w:rPr>
-              <w:t xml:space="preserve">Roter pulsierender Alarm-Banner wenn der Ausbilder einen Kursausfall meldet.</w:t>
-            </w:r>
-          </w:p>
-        </w:tc>
-      </w:tr>
-    </w:tbl>
-    <w:p>
-      <w:pPr>
-        <w:spacing w:after="80"/>
-      </w:pPr>
-    </w:p>
-    <w:tbl>
-      <w:tblPr>
-        <w:tblW w:type="dxa" w:w="9026"/>
-        <w:tblBorders>
-          <w:top w:val="single" w:color="auto" w:sz="4"/>
-          <w:left w:val="single" w:color="auto" w:sz="4"/>
-          <w:bottom w:val="single" w:color="auto" w:sz="4"/>
-          <w:right w:val="single" w:color="auto" w:sz="4"/>
-          <w:insideH w:val="single" w:color="auto" w:sz="4"/>
-          <w:insideV w:val="single" w:color="auto" w:sz="4"/>
-        </w:tblBorders>
-      </w:tblPr>
-      <w:tblGrid>
-        <w:gridCol w:w="600"/>
-        <w:gridCol w:w="8426"/>
-      </w:tblGrid>
-      <w:tr>
-        <w:tc>
-          <w:tcPr>
-            <w:tcW w:type="dxa" w:w="600"/>
-            <w:tcBorders>
-              <w:top w:val="none" w:sz="0"/>
-              <w:left w:val="none" w:sz="0"/>
-              <w:bottom w:val="none" w:sz="0"/>
-              <w:right w:val="none" w:sz="0"/>
-            </w:tcBorders>
-            <w:shd w:fill="F0F4FF" w:val="clear"/>
-            <w:tcMar>
-              <w:top w:type="dxa" w:w="80"/>
-              <w:left w:type="dxa" w:w="80"/>
-              <w:bottom w:type="dxa" w:w="80"/>
-              <w:right w:type="dxa" w:w="40"/>
-            </w:tcMar>
-          </w:tcPr>
-          <w:p>
-            <w:pPr>
-              <w:jc w:val="center"/>
-            </w:pPr>
-            <w:r>
-              <w:rPr>
-                <w:rFonts w:ascii="Arial" w:cs="Arial" w:eastAsia="Arial" w:hAnsi="Arial"/>
-                <w:sz w:val="28"/>
-                <w:szCs w:val="28"/>
-              </w:rPr>
-              <w:t xml:space="preserve">📧</w:t>
-            </w:r>
-          </w:p>
-        </w:tc>
-        <w:tc>
-          <w:tcPr>
-            <w:tcW w:type="dxa" w:w="8426"/>
-            <w:tcBorders>
-              <w:top w:val="none" w:sz="0"/>
-              <w:left w:val="none" w:sz="0"/>
-              <w:bottom w:val="none" w:sz="0"/>
-              <w:right w:val="none" w:sz="0"/>
-            </w:tcBorders>
-            <w:shd w:fill="F0F4FF" w:val="clear"/>
-            <w:tcMar>
-              <w:top w:type="dxa" w:w="80"/>
-              <w:left w:type="dxa" w:w="80"/>
-              <w:bottom w:type="dxa" w:w="80"/>
-              <w:right w:type="dxa" w:w="120"/>
-            </w:tcMar>
-          </w:tcPr>
-          <w:p>
-            <w:r>
-              <w:rPr>
-                <w:rFonts w:ascii="Arial" w:cs="Arial" w:eastAsia="Arial" w:hAnsi="Arial"/>
-                <w:b/>
-                <w:bCs/>
-                <w:color w:val="1E40AF"/>
-                <w:sz w:val="22"/>
-                <w:szCs w:val="22"/>
-              </w:rPr>
-              <w:t xml:space="preserve">Kontakt</w:t>
-            </w:r>
-          </w:p>
-          <w:p>
-            <w:pPr>
-              <w:spacing w:before="40"/>
-            </w:pPr>
-            <w:r>
-              <w:rPr>
-                <w:rFonts w:ascii="Arial" w:cs="Arial" w:eastAsia="Arial" w:hAnsi="Arial"/>
-                <w:color w:val="6B7280"/>
-                <w:sz w:val="20"/>
-                <w:szCs w:val="20"/>
-              </w:rPr>
-              <w:t xml:space="preserve">Ausbilder-Kontaktdaten (Telefon, E-Mail) direkt in der Kurs-Karte.</w:t>
+              <w:t xml:space="preserve">Ausbilder-Kontaktdaten direkt in der Kurs-Karte.</w:t>
             </w:r>
           </w:p>
         </w:tc>
@@ -691,11 +591,11 @@
       <w:r>
         <w:rPr>
           <w:rFonts w:ascii="Arial" w:cs="Arial" w:eastAsia="Arial" w:hAnsi="Arial"/>
-          <w:color w:val="374151"/>
+          <w:color w:val="1F2937"/>
           <w:sz w:val="22"/>
           <w:szCs w:val="22"/>
         </w:rPr>
-        <w:t xml:space="preserve">Wie AzubiPro: Safari/Chrome → ‘Zum Home-Bildschirm’ oder ‘App installieren’.</w:t>
+        <w:t xml:space="preserve">Safari/Chrome → ‘Zum Home-Bildschirm’ oder ‘App installieren’.</w:t>
       </w:r>
     </w:p>
     <w:sectPr>

</xml_diff>